<commit_message>
Sistema Gestion de Pacientes
</commit_message>
<xml_diff>
--- a/sistema_de_clinicas_php/carpeta de información/_INFORMES/Informe SGP 006 informe de avance.docx
+++ b/sistema_de_clinicas_php/carpeta de información/_INFORMES/Informe SGP 006 informe de avance.docx
@@ -1694,7 +1694,7 @@
                 <w:bCs/>
                 <w:lang w:val="es-VE"/>
               </w:rPr>
-              <w:t>Módulo de Médicos y Especialidades</w:t>
+              <w:t>Módulo de Médicos y  Especialidades</w:t>
             </w:r>
           </w:p>
         </w:tc>
@@ -2351,6 +2351,19 @@
         </w:tc>
       </w:tr>
     </w:tbl>
+    <w:p>
+      <w:pPr>
+        <w:pStyle w:val="Normal"/>
+        <w:rPr>
+          <w:b/>
+          <w:bCs/>
+          <w:lang w:val="es-VE"/>
+        </w:rPr>
+      </w:pPr>
+      <w:r>
+        <w:rPr/>
+      </w:r>
+    </w:p>
     <w:p>
       <w:pPr>
         <w:pStyle w:val="Normal"/>
@@ -4977,7 +4990,7 @@
       <mc:AlternateContent>
         <mc:Choice Requires="wps">
           <w:drawing>
-            <wp:anchor behindDoc="1" distT="9525" distB="9525" distL="10160" distR="9525" simplePos="0" locked="0" layoutInCell="0" allowOverlap="1" relativeHeight="9" wp14:anchorId="1C53E33A">
+            <wp:anchor behindDoc="1" distT="9525" distB="9525" distL="10160" distR="9525" simplePos="0" locked="0" layoutInCell="0" allowOverlap="1" relativeHeight="8" wp14:anchorId="1C53E33A">
               <wp:simplePos x="0" y="0"/>
               <wp:positionH relativeFrom="margin">
                 <wp:posOffset>-86995</wp:posOffset>
@@ -5038,7 +5051,7 @@
         </mc:Fallback>
       </mc:AlternateContent>
       <w:drawing>
-        <wp:anchor behindDoc="1" distT="0" distB="0" distL="0" distR="0" simplePos="0" locked="0" layoutInCell="0" allowOverlap="1" relativeHeight="17">
+        <wp:anchor behindDoc="1" distT="0" distB="0" distL="0" distR="0" simplePos="0" locked="0" layoutInCell="0" allowOverlap="1" relativeHeight="16">
           <wp:simplePos x="0" y="0"/>
           <wp:positionH relativeFrom="page">
             <wp:align>right</wp:align>
@@ -5165,7 +5178,7 @@
       <mc:AlternateContent>
         <mc:Choice Requires="wps">
           <w:drawing>
-            <wp:anchor behindDoc="1" distT="9525" distB="9525" distL="10160" distR="9525" simplePos="0" locked="0" layoutInCell="0" allowOverlap="1" relativeHeight="9" wp14:anchorId="1C53E33A">
+            <wp:anchor behindDoc="1" distT="9525" distB="9525" distL="10160" distR="9525" simplePos="0" locked="0" layoutInCell="0" allowOverlap="1" relativeHeight="8" wp14:anchorId="1C53E33A">
               <wp:simplePos x="0" y="0"/>
               <wp:positionH relativeFrom="margin">
                 <wp:posOffset>-86995</wp:posOffset>
@@ -5226,7 +5239,7 @@
         </mc:Fallback>
       </mc:AlternateContent>
       <w:drawing>
-        <wp:anchor behindDoc="1" distT="0" distB="0" distL="0" distR="0" simplePos="0" locked="0" layoutInCell="0" allowOverlap="1" relativeHeight="17">
+        <wp:anchor behindDoc="1" distT="0" distB="0" distL="0" distR="0" simplePos="0" locked="0" layoutInCell="0" allowOverlap="1" relativeHeight="16">
           <wp:simplePos x="0" y="0"/>
           <wp:positionH relativeFrom="page">
             <wp:align>right</wp:align>

</xml_diff>